<commit_message>
fix(acpos): close control and login design dependency gaps
</commit_message>
<xml_diff>
--- a/ACPOS_LOGIN_IDENTITY_ENTRY_Mother_Basic_Design_OPTIMIZED.docx
+++ b/ACPOS_LOGIN_IDENTITY_ENTRY_Mother_Basic_Design_OPTIMIZED.docx
@@ -3714,6 +3714,205 @@
         <w:t>6.  完成登入後導向 WB-01，再由 Global Shell 載入 visible_page_uids。</w:t>
       </w:r>
     </w:p>
+    <w:p>
+      <w:r>
+        <w:br w:type="page"/>
+      </w:r>
+    </w:p>
+    <w:p>
+      <w:pPr>
+        <w:pStyle w:val="Heading1"/>
+      </w:pPr>
+      <w:r>
+        <w:t>Mother Planning / Basic Design Closure Annex｜規劃設計規範閉環補充</w:t>
+      </w:r>
+    </w:p>
+    <w:p>
+      <w:r>
+        <w:t>[ACPOS-20260922-PLANNING-DESIGN-CLOSURE-ANNEX-V1]</w:t>
+      </w:r>
+      <w:r>
+        <w:t xml:space="preserve"> 本附錄只補規劃／基本設計規範缺口；原頁面既有功能、Owner、Operation、Permission、Entity、Visual 與跨頁 Authority 仍為同一 Canonical Owner。不得由本附錄發明 Runtime/API/DB/Provider 行為，也不得建立第二套平行規範。</w:t>
+      </w:r>
+    </w:p>
+    <w:p>
+      <w:pPr>
+        <w:pStyle w:val="Heading2"/>
+      </w:pPr>
+      <w:r>
+        <w:t>Design Dependency / Reference Closure｜登入設計依賴補齊</w:t>
+      </w:r>
+    </w:p>
+    <w:p>
+      <w:r>
+        <w:t>[ACPOS-DESIGN-CLOSURE:LOGIN:DEPENDENCY]</w:t>
+      </w:r>
+    </w:p>
+    <w:tbl>
+      <w:tblPr>
+        <w:tblStyle w:val="TableGrid"/>
+        <w:tblW w:type="auto" w:w="0"/>
+        <w:tblLook w:firstColumn="1" w:firstRow="1" w:lastColumn="0" w:lastRow="0" w:noHBand="0" w:noVBand="1" w:val="04A0"/>
+      </w:tblPr>
+      <w:tblGrid>
+        <w:gridCol w:w="5119"/>
+        <w:gridCol w:w="5119"/>
+      </w:tblGrid>
+      <w:tr>
+        <w:tc>
+          <w:tcPr>
+            <w:tcW w:type="dxa" w:w="5119"/>
+          </w:tcPr>
+          <w:p>
+            <w:r>
+              <w:t>Design Item / 設計項目</w:t>
+            </w:r>
+          </w:p>
+        </w:tc>
+        <w:tc>
+          <w:tcPr>
+            <w:tcW w:type="dxa" w:w="5119"/>
+          </w:tcPr>
+          <w:p>
+            <w:r>
+              <w:t>Canonical Planning Design Contract / 正式規劃設計契約</w:t>
+            </w:r>
+          </w:p>
+        </w:tc>
+      </w:tr>
+      <w:tr>
+        <w:tc>
+          <w:tcPr>
+            <w:tcW w:type="dxa" w:w="5119"/>
+          </w:tcPr>
+          <w:p>
+            <w:r>
+              <w:t>Upstream Design Dependency</w:t>
+            </w:r>
+          </w:p>
+        </w:tc>
+        <w:tc>
+          <w:tcPr>
+            <w:tcW w:type="dxa" w:w="5119"/>
+          </w:tcPr>
+          <w:p>
+            <w:r>
+              <w:t>ACPOS_IAM-01_帳戶與權限_Mother_Basic_Design_OPTIMIZED.docx owns Account / Identity / Permission design truth referenced by Login.</w:t>
+            </w:r>
+          </w:p>
+        </w:tc>
+      </w:tr>
+      <w:tr>
+        <w:tc>
+          <w:tcPr>
+            <w:tcW w:type="dxa" w:w="5119"/>
+          </w:tcPr>
+          <w:p>
+            <w:r>
+              <w:t>Downstream Design Dependency</w:t>
+            </w:r>
+          </w:p>
+        </w:tc>
+        <w:tc>
+          <w:tcPr>
+            <w:tcW w:type="dxa" w:w="5119"/>
+          </w:tcPr>
+          <w:p>
+            <w:r>
+              <w:t>ACPOS_GLOBAL_HOME_SHELL_NAVIGATION_Mother_Basic_Design_OPTIMIZED.docx owns the authenticated Home/Shell/Navigation entry after successful identity admission.</w:t>
+            </w:r>
+          </w:p>
+        </w:tc>
+      </w:tr>
+      <w:tr>
+        <w:tc>
+          <w:tcPr>
+            <w:tcW w:type="dxa" w:w="5119"/>
+          </w:tcPr>
+          <w:p>
+            <w:r>
+              <w:t>Shared-owner Boundary</w:t>
+            </w:r>
+          </w:p>
+        </w:tc>
+        <w:tc>
+          <w:tcPr>
+            <w:tcW w:type="dxa" w:w="5119"/>
+          </w:tcPr>
+          <w:p>
+            <w:r>
+              <w:t>Login does not duplicate IAM permission models or Home navigation registry. It only owns the identity-entry surface and its local states.</w:t>
+            </w:r>
+          </w:p>
+        </w:tc>
+      </w:tr>
+      <w:tr>
+        <w:tc>
+          <w:tcPr>
+            <w:tcW w:type="dxa" w:w="5119"/>
+          </w:tcPr>
+          <w:p>
+            <w:r>
+              <w:t>Success Handoff</w:t>
+            </w:r>
+          </w:p>
+        </w:tc>
+        <w:tc>
+          <w:tcPr>
+            <w:tcW w:type="dxa" w:w="5119"/>
+          </w:tcPr>
+          <w:p>
+            <w:r>
+              <w:t>Successful identity admission hands the authenticated context to the current Home/Shell entry defined by Global Navigation.</w:t>
+            </w:r>
+          </w:p>
+        </w:tc>
+      </w:tr>
+      <w:tr>
+        <w:tc>
+          <w:tcPr>
+            <w:tcW w:type="dxa" w:w="5119"/>
+          </w:tcPr>
+          <w:p>
+            <w:r>
+              <w:t>Failure / Resume</w:t>
+            </w:r>
+          </w:p>
+        </w:tc>
+        <w:tc>
+          <w:tcPr>
+            <w:tcW w:type="dxa" w:w="5119"/>
+          </w:tcPr>
+          <w:p>
+            <w:r>
+              <w:t>Authentication/identity failure remains on the Login surface with explicit error/recovery state; no unauthorized downstream navigation.</w:t>
+            </w:r>
+          </w:p>
+        </w:tc>
+      </w:tr>
+      <w:tr>
+        <w:tc>
+          <w:tcPr>
+            <w:tcW w:type="dxa" w:w="5119"/>
+          </w:tcPr>
+          <w:p>
+            <w:r>
+              <w:t>Dependency Change Impact</w:t>
+            </w:r>
+          </w:p>
+        </w:tc>
+        <w:tc>
+          <w:tcPr>
+            <w:tcW w:type="dxa" w:w="5119"/>
+          </w:tcPr>
+          <w:p>
+            <w:r>
+              <w:t>IAM identity/permission contract or Home entry/navigation changes require Login design reference revalidation before design freeze.</w:t>
+            </w:r>
+          </w:p>
+        </w:tc>
+      </w:tr>
+    </w:tbl>
     <w:sectPr>
       <w:footerReference w:type="default" r:id="rId9"/>
       <w:pgSz w:w="11909" w:h="16834"/>

</xml_diff>